<commit_message>
Stat band on every .docx, two-line contact block, no split bullets
A CV with highlights downloaded as a .docx without them: only the
dossier and column templates carried the band, and classic is the
default. The band now lives once in doc-kit and every design has it.
The contact block is two lines in both formats — with the phone on it,
Word wrapped the portfolio URL at its hyphen. And a bullet never splits
across pages in the PDFs: a production download ended page one with a
lone glyph and began page two with its sentence. Page breaks are now
stress-tested with a three-times-longer CV at four break positions.

Co-Authored-By: Claude Opus 5 <noreply@anthropic.com>
</commit_message>
<xml_diff>
--- a/templates/cv-field.docx
+++ b/templates/cv-field.docx
@@ -51,6 +51,148 @@
           <w:szCs w:val="18"/>
         </w:rPr>
         <w:t xml:space="preserve">{contactLine}</w:t>
+      </w:r>
+    </w:p>
+    <w:p>
+      <w:r>
+        <w:t xml:space="preserve">{#hasHighlights}</w:t>
+      </w:r>
+    </w:p>
+    <w:p>
+      <w:pPr>
+        <w:pStyle w:val="Body"/>
+        <w:keepNext/>
+        <w:tabs>
+          <w:tab w:val="left" w:pos="2410"/>
+          <w:tab w:val="left" w:pos="4820"/>
+          <w:tab w:val="left" w:pos="7230"/>
+        </w:tabs>
+        <w:spacing w:after="0"/>
+      </w:pPr>
+      <w:r>
+        <w:rPr>
+          <w:rFonts w:ascii="Geist" w:hAnsi="Geist" w:cs="Geist"/>
+          <w:b/>
+          <w:color w:val="1277D9"/>
+          <w:spacing w:val="-10"/>
+          <w:sz w:val="32"/>
+          <w:szCs w:val="32"/>
+        </w:rPr>
+        <w:t xml:space="preserve">{h1value}</w:t>
+      </w:r>
+      <w:r>
+        <w:tab/>
+      </w:r>
+      <w:r>
+        <w:rPr>
+          <w:rFonts w:ascii="Geist" w:hAnsi="Geist" w:cs="Geist"/>
+          <w:b/>
+          <w:color w:val="1277D9"/>
+          <w:spacing w:val="-10"/>
+          <w:sz w:val="32"/>
+          <w:szCs w:val="32"/>
+        </w:rPr>
+        <w:t xml:space="preserve">{h2value}</w:t>
+      </w:r>
+      <w:r>
+        <w:tab/>
+      </w:r>
+      <w:r>
+        <w:rPr>
+          <w:rFonts w:ascii="Geist" w:hAnsi="Geist" w:cs="Geist"/>
+          <w:b/>
+          <w:color w:val="1277D9"/>
+          <w:spacing w:val="-10"/>
+          <w:sz w:val="32"/>
+          <w:szCs w:val="32"/>
+        </w:rPr>
+        <w:t xml:space="preserve">{h3value}</w:t>
+      </w:r>
+      <w:r>
+        <w:tab/>
+      </w:r>
+      <w:r>
+        <w:rPr>
+          <w:rFonts w:ascii="Geist" w:hAnsi="Geist" w:cs="Geist"/>
+          <w:b/>
+          <w:color w:val="1277D9"/>
+          <w:spacing w:val="-10"/>
+          <w:sz w:val="32"/>
+          <w:szCs w:val="32"/>
+        </w:rPr>
+        <w:t xml:space="preserve">{h4value}</w:t>
+      </w:r>
+    </w:p>
+    <w:p>
+      <w:pPr>
+        <w:pStyle w:val="Body"/>
+        <w:pBdr>
+          <w:bottom w:val="single" w:sz="4" w:space="8" w:color="E4E4E8"/>
+        </w:pBdr>
+        <w:tabs>
+          <w:tab w:val="left" w:pos="2410"/>
+          <w:tab w:val="left" w:pos="4820"/>
+          <w:tab w:val="left" w:pos="7230"/>
+        </w:tabs>
+        <w:spacing w:after="260"/>
+      </w:pPr>
+      <w:r>
+        <w:rPr>
+          <w:rFonts w:ascii="Geist" w:hAnsi="Geist" w:cs="Geist"/>
+          <w:caps/>
+          <w:color w:val="8A8A9C"/>
+          <w:spacing w:val="24"/>
+          <w:sz w:val="15"/>
+          <w:szCs w:val="15"/>
+        </w:rPr>
+        <w:t xml:space="preserve">{h1label}</w:t>
+      </w:r>
+      <w:r>
+        <w:tab/>
+      </w:r>
+      <w:r>
+        <w:rPr>
+          <w:rFonts w:ascii="Geist" w:hAnsi="Geist" w:cs="Geist"/>
+          <w:caps/>
+          <w:color w:val="8A8A9C"/>
+          <w:spacing w:val="24"/>
+          <w:sz w:val="15"/>
+          <w:szCs w:val="15"/>
+        </w:rPr>
+        <w:t xml:space="preserve">{h2label}</w:t>
+      </w:r>
+      <w:r>
+        <w:tab/>
+      </w:r>
+      <w:r>
+        <w:rPr>
+          <w:rFonts w:ascii="Geist" w:hAnsi="Geist" w:cs="Geist"/>
+          <w:caps/>
+          <w:color w:val="8A8A9C"/>
+          <w:spacing w:val="24"/>
+          <w:sz w:val="15"/>
+          <w:szCs w:val="15"/>
+        </w:rPr>
+        <w:t xml:space="preserve">{h3label}</w:t>
+      </w:r>
+      <w:r>
+        <w:tab/>
+      </w:r>
+      <w:r>
+        <w:rPr>
+          <w:rFonts w:ascii="Geist" w:hAnsi="Geist" w:cs="Geist"/>
+          <w:caps/>
+          <w:color w:val="8A8A9C"/>
+          <w:spacing w:val="24"/>
+          <w:sz w:val="15"/>
+          <w:szCs w:val="15"/>
+        </w:rPr>
+        <w:t xml:space="preserve">{h4label}</w:t>
+      </w:r>
+    </w:p>
+    <w:p>
+      <w:r>
+        <w:t xml:space="preserve">{/hasHighlights}</w:t>
       </w:r>
     </w:p>
     <w:p>

</xml_diff>

<commit_message>
Stat band on every .docx, two-line contact block, no split bullets (#43)
A CV with highlights downloaded as a .docx without them: only the
dossier and column templates carried the band, and classic is the
default. The band now lives once in doc-kit and every design has it.
The contact block is two lines in both formats — with the phone on it,
Word wrapped the portfolio URL at its hyphen. And a bullet never splits
across pages in the PDFs: a production download ended page one with a
lone glyph and began page two with its sentence. Page breaks are now
stress-tested with a three-times-longer CV at four break positions.

Co-authored-by: Claude Opus 5 <noreply@anthropic.com>
</commit_message>
<xml_diff>
--- a/templates/cv-field.docx
+++ b/templates/cv-field.docx
@@ -51,6 +51,148 @@
           <w:szCs w:val="18"/>
         </w:rPr>
         <w:t xml:space="preserve">{contactLine}</w:t>
+      </w:r>
+    </w:p>
+    <w:p>
+      <w:r>
+        <w:t xml:space="preserve">{#hasHighlights}</w:t>
+      </w:r>
+    </w:p>
+    <w:p>
+      <w:pPr>
+        <w:pStyle w:val="Body"/>
+        <w:keepNext/>
+        <w:tabs>
+          <w:tab w:val="left" w:pos="2410"/>
+          <w:tab w:val="left" w:pos="4820"/>
+          <w:tab w:val="left" w:pos="7230"/>
+        </w:tabs>
+        <w:spacing w:after="0"/>
+      </w:pPr>
+      <w:r>
+        <w:rPr>
+          <w:rFonts w:ascii="Geist" w:hAnsi="Geist" w:cs="Geist"/>
+          <w:b/>
+          <w:color w:val="1277D9"/>
+          <w:spacing w:val="-10"/>
+          <w:sz w:val="32"/>
+          <w:szCs w:val="32"/>
+        </w:rPr>
+        <w:t xml:space="preserve">{h1value}</w:t>
+      </w:r>
+      <w:r>
+        <w:tab/>
+      </w:r>
+      <w:r>
+        <w:rPr>
+          <w:rFonts w:ascii="Geist" w:hAnsi="Geist" w:cs="Geist"/>
+          <w:b/>
+          <w:color w:val="1277D9"/>
+          <w:spacing w:val="-10"/>
+          <w:sz w:val="32"/>
+          <w:szCs w:val="32"/>
+        </w:rPr>
+        <w:t xml:space="preserve">{h2value}</w:t>
+      </w:r>
+      <w:r>
+        <w:tab/>
+      </w:r>
+      <w:r>
+        <w:rPr>
+          <w:rFonts w:ascii="Geist" w:hAnsi="Geist" w:cs="Geist"/>
+          <w:b/>
+          <w:color w:val="1277D9"/>
+          <w:spacing w:val="-10"/>
+          <w:sz w:val="32"/>
+          <w:szCs w:val="32"/>
+        </w:rPr>
+        <w:t xml:space="preserve">{h3value}</w:t>
+      </w:r>
+      <w:r>
+        <w:tab/>
+      </w:r>
+      <w:r>
+        <w:rPr>
+          <w:rFonts w:ascii="Geist" w:hAnsi="Geist" w:cs="Geist"/>
+          <w:b/>
+          <w:color w:val="1277D9"/>
+          <w:spacing w:val="-10"/>
+          <w:sz w:val="32"/>
+          <w:szCs w:val="32"/>
+        </w:rPr>
+        <w:t xml:space="preserve">{h4value}</w:t>
+      </w:r>
+    </w:p>
+    <w:p>
+      <w:pPr>
+        <w:pStyle w:val="Body"/>
+        <w:pBdr>
+          <w:bottom w:val="single" w:sz="4" w:space="8" w:color="E4E4E8"/>
+        </w:pBdr>
+        <w:tabs>
+          <w:tab w:val="left" w:pos="2410"/>
+          <w:tab w:val="left" w:pos="4820"/>
+          <w:tab w:val="left" w:pos="7230"/>
+        </w:tabs>
+        <w:spacing w:after="260"/>
+      </w:pPr>
+      <w:r>
+        <w:rPr>
+          <w:rFonts w:ascii="Geist" w:hAnsi="Geist" w:cs="Geist"/>
+          <w:caps/>
+          <w:color w:val="8A8A9C"/>
+          <w:spacing w:val="24"/>
+          <w:sz w:val="15"/>
+          <w:szCs w:val="15"/>
+        </w:rPr>
+        <w:t xml:space="preserve">{h1label}</w:t>
+      </w:r>
+      <w:r>
+        <w:tab/>
+      </w:r>
+      <w:r>
+        <w:rPr>
+          <w:rFonts w:ascii="Geist" w:hAnsi="Geist" w:cs="Geist"/>
+          <w:caps/>
+          <w:color w:val="8A8A9C"/>
+          <w:spacing w:val="24"/>
+          <w:sz w:val="15"/>
+          <w:szCs w:val="15"/>
+        </w:rPr>
+        <w:t xml:space="preserve">{h2label}</w:t>
+      </w:r>
+      <w:r>
+        <w:tab/>
+      </w:r>
+      <w:r>
+        <w:rPr>
+          <w:rFonts w:ascii="Geist" w:hAnsi="Geist" w:cs="Geist"/>
+          <w:caps/>
+          <w:color w:val="8A8A9C"/>
+          <w:spacing w:val="24"/>
+          <w:sz w:val="15"/>
+          <w:szCs w:val="15"/>
+        </w:rPr>
+        <w:t xml:space="preserve">{h3label}</w:t>
+      </w:r>
+      <w:r>
+        <w:tab/>
+      </w:r>
+      <w:r>
+        <w:rPr>
+          <w:rFonts w:ascii="Geist" w:hAnsi="Geist" w:cs="Geist"/>
+          <w:caps/>
+          <w:color w:val="8A8A9C"/>
+          <w:spacing w:val="24"/>
+          <w:sz w:val="15"/>
+          <w:szCs w:val="15"/>
+        </w:rPr>
+        <w:t xml:space="preserve">{h4label}</w:t>
+      </w:r>
+    </w:p>
+    <w:p>
+      <w:r>
+        <w:t xml:space="preserve">{/hasHighlights}</w:t>
       </w:r>
     </w:p>
     <w:p>

</xml_diff>